<commit_message>
feat: integrar dados 2025-2026 e analise territorial em Obidos (Assentamentos, Quilombolas, UCs e TIs)
- Download e ingestao completa dos dados do INPE para 2025 e 2026 (ate 26/08/2026)
- Classificacao espacial estratificada em Obidos: Projetos de Assentamento (PA/PAE), Territorios Quilombolas (TQ), Unidades de Conservacao (UC) e Terras Indigenas (TI)
- Nova aba no Dashboard com KPIs, graficos interativos de alto contraste e tabelas detalhadas
- Capitulo territorial e tabelas completas inseridas no relatorio tecnico oficial PDF e no artigo academico DOCX
- 30+ graficos cientificos atualizados com tipografia preta pura (#000000)
</commit_message>
<xml_diff>
--- a/Projeto_Queimadas_Artigo.docx
+++ b/Projeto_Queimadas_Artigo.docx
@@ -2144,7 +2144,7 @@
           <w:color w:val="1E3A8A"/>
           <w:sz w:val="24"/>
         </w:rPr>
-        <w:t>5.1 Análise Histórica e Temporal de Óbidos (2020 a 2024)</w:t>
+        <w:t>5.1 Análise Histórica e Temporal de Óbidos (2020 a 2026)</w:t>
       </w:r>
     </w:p>
     <w:p>
@@ -2158,7 +2158,7 @@
           <w:color w:val="1E293B"/>
           <w:sz w:val="22"/>
         </w:rPr>
-        <w:t>A aplicação do pipeline sobre a base histórica completa do Estado do Pará permitiu extrair métricas consolidadas sobre o comportamento das queimadas no município de Óbidos em relação ao panorama estadual. A Tabela 2 sintetiza os totais anuais de focos detectados, a representatividade relativa (%) e a variação anual (YoY) no período de 2020 a 2024.</w:t>
+        <w:t>A aplicação do pipeline sobre a base histórica completa do Estado do Pará (2020 a 2026, consolidada até 26 de agosto de 2026) permitiu extrair métricas sobre o comportamento das queimadas no município de Óbidos em relação ao panorama estadual. A Tabela 2 sintetiza os totais anuais de focos detectados, a representatividade relativa (%) e a variação anual (YoY) no período de 2020 a 2026.</w:t>
       </w:r>
     </w:p>
     <w:p>
@@ -2173,7 +2173,7 @@
           <w:color w:val="475569"/>
           <w:sz w:val="19"/>
         </w:rPr>
-        <w:t>Tabela 2 – Resumo histórico de focos de queimadas detectados em Óbidos e no Estado do Pará (2020 a 2024). Fonte: Compilado pelos autores a partir de dados do INPE (2026).</w:t>
+        <w:t>Tabela 2 – Resumo histórico de focos de queimadas detectados em Óbidos e no Estado do Pará (2020 a 2026 até 26/08/2026). Fonte: Compilado pelos autores a partir de dados do INPE (2026).</w:t>
       </w:r>
     </w:p>
     <w:tbl>
@@ -2735,7 +2735,7 @@
                 <w:color w:val="1E293B"/>
                 <w:sz w:val="18"/>
               </w:rPr>
-              <w:t>44.105</w:t>
+              <w:t>41.715</w:t>
             </w:r>
           </w:p>
         </w:tc>
@@ -2754,7 +2754,7 @@
                 <w:color w:val="1E293B"/>
                 <w:sz w:val="18"/>
               </w:rPr>
-              <w:t>+0,26%</w:t>
+              <w:t>-5,18%</w:t>
             </w:r>
           </w:p>
         </w:tc>
@@ -2773,7 +2773,7 @@
                 <w:color w:val="1E293B"/>
                 <w:sz w:val="18"/>
               </w:rPr>
-              <w:t>2,83%</w:t>
+              <w:t>2,99%</w:t>
             </w:r>
           </w:p>
         </w:tc>
@@ -2870,7 +2870,7 @@
                 <w:color w:val="1E293B"/>
                 <w:sz w:val="18"/>
               </w:rPr>
-              <w:t>+35,70%</w:t>
+              <w:t>+43,47%</w:t>
             </w:r>
           </w:p>
         </w:tc>
@@ -2910,7 +2910,7 @@
                 <w:color w:val="1E293B"/>
                 <w:sz w:val="18"/>
               </w:rPr>
-              <w:t>Total / Média</w:t>
+              <w:t>2025</w:t>
             </w:r>
           </w:p>
         </w:tc>
@@ -2929,7 +2929,7 @@
                 <w:color w:val="1E293B"/>
                 <w:sz w:val="18"/>
               </w:rPr>
-              <w:t>3.374</w:t>
+              <w:t>531</w:t>
             </w:r>
           </w:p>
         </w:tc>
@@ -2948,7 +2948,7 @@
                 <w:color w:val="1E293B"/>
                 <w:sz w:val="18"/>
               </w:rPr>
-              <w:t>Média: 674,8/ano</w:t>
+              <w:t>-25,00%</w:t>
             </w:r>
           </w:p>
         </w:tc>
@@ -2967,7 +2967,7 @@
                 <w:color w:val="1E293B"/>
                 <w:sz w:val="18"/>
               </w:rPr>
-              <w:t>218.458</w:t>
+              <w:t>36.892</w:t>
             </w:r>
           </w:p>
         </w:tc>
@@ -2986,7 +2986,7 @@
                 <w:color w:val="1E293B"/>
                 <w:sz w:val="18"/>
               </w:rPr>
-              <w:t>Média: 43.691/ano</w:t>
+              <w:t>-38,36%</w:t>
             </w:r>
           </w:p>
         </w:tc>
@@ -3005,7 +3005,239 @@
                 <w:color w:val="1E293B"/>
                 <w:sz w:val="18"/>
               </w:rPr>
-              <w:t>1,54%</w:t>
+              <w:t>1,44%</w:t>
+            </w:r>
+          </w:p>
+        </w:tc>
+      </w:tr>
+      <w:tr>
+        <w:tc>
+          <w:tcPr>
+            <w:tcW w:type="dxa" w:w="1152"/>
+            <w:shd w:fill="FFFFFF"/>
+          </w:tcPr>
+          <w:p>
+            <w:pPr>
+              <w:spacing w:before="60" w:after="60"/>
+              <w:jc w:val="center"/>
+            </w:pPr>
+            <w:r>
+              <w:rPr>
+                <w:color w:val="1E293B"/>
+                <w:sz w:val="18"/>
+              </w:rPr>
+              <w:t>2026 (até 26/ago)</w:t>
+            </w:r>
+          </w:p>
+        </w:tc>
+        <w:tc>
+          <w:tcPr>
+            <w:tcW w:type="dxa" w:w="1440"/>
+            <w:shd w:fill="FFFFFF"/>
+          </w:tcPr>
+          <w:p>
+            <w:pPr>
+              <w:spacing w:before="60" w:after="60"/>
+              <w:jc w:val="left"/>
+            </w:pPr>
+            <w:r>
+              <w:rPr>
+                <w:color w:val="1E293B"/>
+                <w:sz w:val="18"/>
+              </w:rPr>
+              <w:t>1.716</w:t>
+            </w:r>
+          </w:p>
+        </w:tc>
+        <w:tc>
+          <w:tcPr>
+            <w:tcW w:type="dxa" w:w="1872"/>
+            <w:shd w:fill="FFFFFF"/>
+          </w:tcPr>
+          <w:p>
+            <w:pPr>
+              <w:spacing w:before="60" w:after="60"/>
+              <w:jc w:val="center"/>
+            </w:pPr>
+            <w:r>
+              <w:rPr>
+                <w:color w:val="1E293B"/>
+                <w:sz w:val="18"/>
+              </w:rPr>
+              <w:t>+223,16%</w:t>
+            </w:r>
+          </w:p>
+        </w:tc>
+        <w:tc>
+          <w:tcPr>
+            <w:tcW w:type="dxa" w:w="1584"/>
+            <w:shd w:fill="FFFFFF"/>
+          </w:tcPr>
+          <w:p>
+            <w:pPr>
+              <w:spacing w:before="60" w:after="60"/>
+              <w:jc w:val="center"/>
+            </w:pPr>
+            <w:r>
+              <w:rPr>
+                <w:color w:val="1E293B"/>
+                <w:sz w:val="18"/>
+              </w:rPr>
+              <w:t>125.742</w:t>
+            </w:r>
+          </w:p>
+        </w:tc>
+        <w:tc>
+          <w:tcPr>
+            <w:tcW w:type="dxa" w:w="1728"/>
+            <w:shd w:fill="FFFFFF"/>
+          </w:tcPr>
+          <w:p>
+            <w:pPr>
+              <w:spacing w:before="60" w:after="60"/>
+              <w:jc w:val="center"/>
+            </w:pPr>
+            <w:r>
+              <w:rPr>
+                <w:color w:val="1E293B"/>
+                <w:sz w:val="18"/>
+              </w:rPr>
+              <w:t>+240,84%</w:t>
+            </w:r>
+          </w:p>
+        </w:tc>
+        <w:tc>
+          <w:tcPr>
+            <w:tcW w:type="dxa" w:w="1440"/>
+            <w:shd w:fill="FFFFFF"/>
+          </w:tcPr>
+          <w:p>
+            <w:pPr>
+              <w:spacing w:before="60" w:after="60"/>
+              <w:jc w:val="center"/>
+            </w:pPr>
+            <w:r>
+              <w:rPr>
+                <w:color w:val="1E293B"/>
+                <w:sz w:val="18"/>
+              </w:rPr>
+              <w:t>1,36%</w:t>
+            </w:r>
+          </w:p>
+        </w:tc>
+      </w:tr>
+      <w:tr>
+        <w:tc>
+          <w:tcPr>
+            <w:tcW w:type="dxa" w:w="1152"/>
+            <w:shd w:fill="F8FAFC"/>
+          </w:tcPr>
+          <w:p>
+            <w:pPr>
+              <w:spacing w:before="60" w:after="60"/>
+              <w:jc w:val="center"/>
+            </w:pPr>
+            <w:r>
+              <w:rPr>
+                <w:color w:val="1E293B"/>
+                <w:sz w:val="18"/>
+              </w:rPr>
+              <w:t>Total Consolidado</w:t>
+            </w:r>
+          </w:p>
+        </w:tc>
+        <w:tc>
+          <w:tcPr>
+            <w:tcW w:type="dxa" w:w="1440"/>
+            <w:shd w:fill="F8FAFC"/>
+          </w:tcPr>
+          <w:p>
+            <w:pPr>
+              <w:spacing w:before="60" w:after="60"/>
+              <w:jc w:val="left"/>
+            </w:pPr>
+            <w:r>
+              <w:rPr>
+                <w:color w:val="1E293B"/>
+                <w:sz w:val="18"/>
+              </w:rPr>
+              <w:t>5.621</w:t>
+            </w:r>
+          </w:p>
+        </w:tc>
+        <w:tc>
+          <w:tcPr>
+            <w:tcW w:type="dxa" w:w="1872"/>
+            <w:shd w:fill="F8FAFC"/>
+          </w:tcPr>
+          <w:p>
+            <w:pPr>
+              <w:spacing w:before="60" w:after="60"/>
+              <w:jc w:val="center"/>
+            </w:pPr>
+            <w:r>
+              <w:rPr>
+                <w:color w:val="1E293B"/>
+                <w:sz w:val="18"/>
+              </w:rPr>
+              <w:t>Média: 803,0/ano</w:t>
+            </w:r>
+          </w:p>
+        </w:tc>
+        <w:tc>
+          <w:tcPr>
+            <w:tcW w:type="dxa" w:w="1584"/>
+            <w:shd w:fill="F8FAFC"/>
+          </w:tcPr>
+          <w:p>
+            <w:pPr>
+              <w:spacing w:before="60" w:after="60"/>
+              <w:jc w:val="center"/>
+            </w:pPr>
+            <w:r>
+              <w:rPr>
+                <w:color w:val="1E293B"/>
+                <w:sz w:val="18"/>
+              </w:rPr>
+              <w:t>378.702</w:t>
+            </w:r>
+          </w:p>
+        </w:tc>
+        <w:tc>
+          <w:tcPr>
+            <w:tcW w:type="dxa" w:w="1728"/>
+            <w:shd w:fill="F8FAFC"/>
+          </w:tcPr>
+          <w:p>
+            <w:pPr>
+              <w:spacing w:before="60" w:after="60"/>
+              <w:jc w:val="center"/>
+            </w:pPr>
+            <w:r>
+              <w:rPr>
+                <w:color w:val="1E293B"/>
+                <w:sz w:val="18"/>
+              </w:rPr>
+              <w:t>Média: 54.100/ano</w:t>
+            </w:r>
+          </w:p>
+        </w:tc>
+        <w:tc>
+          <w:tcPr>
+            <w:tcW w:type="dxa" w:w="1440"/>
+            <w:shd w:fill="F8FAFC"/>
+          </w:tcPr>
+          <w:p>
+            <w:pPr>
+              <w:spacing w:before="60" w:after="60"/>
+              <w:jc w:val="center"/>
+            </w:pPr>
+            <w:r>
+              <w:rPr>
+                <w:color w:val="1E293B"/>
+                <w:sz w:val="18"/>
+              </w:rPr>
+              <w:t>1,48%</w:t>
             </w:r>
           </w:p>
         </w:tc>
@@ -3027,7 +3259,7 @@
           <w:color w:val="1E293B"/>
           <w:sz w:val="22"/>
         </w:rPr>
-        <w:t>Observa-se que o ano de 2023 registrou um pico extraordinário em Óbidos com 1.249 focos — um aumento expressivo de +191,82% em relação a 2022 —, elevando a representatividade do município para 2,83% de todas as queimadas do Pará. Esse evento atípico correlaciona-se com a severa seca provocada pela intensificação do fenômeno El Niño na bacia do Rio Amazonas em 2023, que comprometeu os níveis fluviais e aumentou a inflamabilidade da floresta primária e secundária na Calha Norte do Pará.</w:t>
+        <w:t>Observa-se que o ano de 2023 registrou um pico histórico em Óbidos com 1.249 focos — um aumento de +191,82% em relação a 2022 —, correlacionado à severa seca provocada pela intensificação do El Niño na bacia amazônica. Em 2026, até 26 de agosto, o acumulado atingiu 1.716 focos em virtude do adiantamento do período de estiagem na Calha Norte do Pará.</w:t>
       </w:r>
     </w:p>
     <w:p>
@@ -3041,7 +3273,7 @@
           <w:color w:val="1E293B"/>
           <w:sz w:val="22"/>
         </w:rPr>
-        <w:t>A Figura 9 ilustra os totais anuais de focos em Óbidos em comparação com a média histórica municipal (674,8 focos/ano).</w:t>
+        <w:t>A Figura 9 ilustra os totais anuais de focos em Óbidos em comparação com a série multianual.</w:t>
       </w:r>
     </w:p>
     <w:p>
@@ -3096,7 +3328,7 @@
           <w:color w:val="475569"/>
           <w:sz w:val="19"/>
         </w:rPr>
-        <w:t>Figura 9 – Totais anuais de focos de queimadas em Óbidos (PA) no período 2020–2024 e linha de média histórica. Fonte: Gerado pelo pipeline scripts/graficos.py (2026).</w:t>
+        <w:t>Figura 9 – Totais anuais de focos de queimadas em Óbidos (PA) no período 2020–2026. Fonte: Gerado pelo pipeline scripts/graficos.py (2026).</w:t>
       </w:r>
     </w:p>
     <w:p>
@@ -3110,7 +3342,7 @@
           <w:color w:val="1E293B"/>
           <w:sz w:val="22"/>
         </w:rPr>
-        <w:t>A série temporal completa (mês a mês) ao longo de todo o quinquênio 2020–2024 é apresentada na Figura 10, demonstrando a recorrência estrita dos picos de queima no segundo semestre de cada ano.</w:t>
+        <w:t>A série temporal completa ao longo de todo o período 2020–2026 é apresentada na Figura 10, demonstrando a recorrência estrita dos picos de queima no segundo semestre de cada ano.</w:t>
       </w:r>
     </w:p>
     <w:p>
@@ -3165,7 +3397,7 @@
           <w:color w:val="475569"/>
           <w:sz w:val="19"/>
         </w:rPr>
-        <w:t>Figura 10 – Série temporal histórica contínua de focos de queimadas em Óbidos (PA) entre 2020 e 2024. Fonte: Gerado pelo pipeline scripts/graficos.py (2026).</w:t>
+        <w:t>Figura 10 – Série temporal histórica contínua de focos de queimadas em Óbidos (PA) entre 2020 e 2026. Fonte: Gerado pelo pipeline scripts/graficos.py (2026).</w:t>
       </w:r>
     </w:p>
     <w:p>
@@ -3195,7 +3427,7 @@
           <w:color w:val="1E293B"/>
           <w:sz w:val="22"/>
         </w:rPr>
-        <w:t>A análise de sazonalidade revelou que o regime de queimadas em Óbidos e no Pará obedece a um padrão bimodal climático nítido:</w:t>
+        <w:t>A análise de sazonalidade confirmou que o regime de queimadas em Óbidos obedece a um padrão bimodal climático:</w:t>
       </w:r>
     </w:p>
     <w:p>
@@ -3216,7 +3448,7 @@
           <w:color w:val="1E293B"/>
           <w:sz w:val="21"/>
         </w:rPr>
-        <w:t>Janeiro a Maio, caracterizado por chuvas intensas e focos residuais (menos de 2% do acumulado anual);</w:t>
+        <w:t>Janeiro a Maio, com chuvas intensas e focos residuais;</w:t>
       </w:r>
     </w:p>
     <w:p>
@@ -3258,21 +3490,7 @@
           <w:color w:val="1E293B"/>
           <w:sz w:val="21"/>
         </w:rPr>
-        <w:t>Agosto a Novembro, com ápice concentrado em Setembro, Outubro e Novembro, respondendo por mais de 83% do total de ocorrências.</w:t>
-      </w:r>
-    </w:p>
-    <w:p>
-      <w:pPr>
-        <w:spacing w:line="288" w:lineRule="auto" w:after="120"/>
-        <w:jc w:val="both"/>
-      </w:pPr>
-      <w:r>
-        <w:rPr>
-          <w:i w:val="0"/>
-          <w:color w:val="1E293B"/>
-          <w:sz w:val="22"/>
-        </w:rPr>
-        <w:t>O mapa de calor matricial da Figura 11 expressa a densidade mensal de focos em Óbidos ao longo dos anos, evidenciando que outubro de 2020 (218 focos), outubro de 2023 (617 focos) e novembro de 2023 (412 focos) foram os momentos mais críticos registrados.</w:t>
+        <w:t>Agosto a Novembro, com ápice concentrado em Setembro, Outubro e Novembro, respondendo por mais de 80% do total de ocorrências anuais.</w:t>
       </w:r>
     </w:p>
     <w:p>
@@ -3327,76 +3545,7 @@
           <w:color w:val="475569"/>
           <w:sz w:val="19"/>
         </w:rPr>
-        <w:t>Figura 11 – Mapa de calor matricial (Heatmap) da distribuição mensal de focos de queimadas em Óbidos (2020–2024). Fonte: Gerado pelo pipeline scripts/graficos.py (2026).</w:t>
-      </w:r>
-    </w:p>
-    <w:p>
-      <w:pPr>
-        <w:spacing w:line="288" w:lineRule="auto" w:after="120"/>
-        <w:jc w:val="both"/>
-      </w:pPr>
-      <w:r>
-        <w:rPr>
-          <w:i w:val="0"/>
-          <w:color w:val="1E293B"/>
-          <w:sz w:val="22"/>
-        </w:rPr>
-        <w:t>A Figura 12 apresenta a variação percentual mês a mês (MoM) em Óbidos para o ano de 2024, evidenciando a aceleração das queimadas no início do segundo semestre.</w:t>
-      </w:r>
-    </w:p>
-    <w:p>
-      <w:pPr>
-        <w:keepNext/>
-        <w:spacing w:before="200" w:after="80"/>
-        <w:jc w:val="center"/>
-      </w:pPr>
-      <w:r>
-        <w:drawing>
-          <wp:inline xmlns:a="http://schemas.openxmlformats.org/drawingml/2006/main" xmlns:pic="http://schemas.openxmlformats.org/drawingml/2006/picture">
-            <wp:extent cx="5303520" cy="2624975"/>
-            <wp:docPr id="12" name="Picture 12"/>
-            <wp:cNvGraphicFramePr>
-              <a:graphicFrameLocks noChangeAspect="1"/>
-            </wp:cNvGraphicFramePr>
-            <a:graphic>
-              <a:graphicData uri="http://schemas.openxmlformats.org/drawingml/2006/picture">
-                <pic:pic>
-                  <pic:nvPicPr>
-                    <pic:cNvPr id="0" name="obidos_variacao_2024.png"/>
-                    <pic:cNvPicPr/>
-                  </pic:nvPicPr>
-                  <pic:blipFill>
-                    <a:blip r:embed="rId20"/>
-                    <a:stretch>
-                      <a:fillRect/>
-                    </a:stretch>
-                  </pic:blipFill>
-                  <pic:spPr>
-                    <a:xfrm>
-                      <a:off x="0" y="0"/>
-                      <a:ext cx="5303520" cy="2624975"/>
-                    </a:xfrm>
-                    <a:prstGeom prst="rect"/>
-                  </pic:spPr>
-                </pic:pic>
-              </a:graphicData>
-            </a:graphic>
-          </wp:inline>
-        </w:drawing>
-      </w:r>
-    </w:p>
-    <w:p>
-      <w:pPr>
-        <w:spacing w:before="0" w:after="240"/>
-        <w:jc w:val="center"/>
-      </w:pPr>
-      <w:r>
-        <w:rPr>
-          <w:b/>
-          <w:color w:val="475569"/>
-          <w:sz w:val="19"/>
-        </w:rPr>
-        <w:t>Figura 12 – Variação percentual mês a mês (MoM) de focos de queimadas em Óbidos no ano de 2024. Fonte: Gerado pelo pipeline scripts/graficos.py (2026).</w:t>
+        <w:t>Figura 11 – Mapa de calor matricial (Heatmap) da distribuição mensal de focos de queimadas em Óbidos (2020–2026). Fonte: Gerado pelo pipeline scripts/graficos.py (2026).</w:t>
       </w:r>
     </w:p>
     <w:p>
@@ -3426,7 +3575,7 @@
           <w:color w:val="1E293B"/>
           <w:sz w:val="22"/>
         </w:rPr>
-        <w:t>No panorama global do Estado do Pará (total de 144 municípios), a análise agregada de 2020 a 2024 revelou forte concentração espacial nos municípios do sudeste e sudoeste paraense (denominado Arco do Desmatamento). A Tabela 3 apresenta os 10 municípios líderes em ocorrências no quinquênio e a posição relativa de Óbidos.</w:t>
+        <w:t>No panorama consolidado do Estado do Pará (144 municípios), a análise agregada de 2020 a 2026 revelou forte concentração espacial nos municípios do sudoeste e sudeste paraense. A Tabela 3 apresenta os 10 municípios líderes em ocorrências no período e a colocação de Óbidos.</w:t>
       </w:r>
     </w:p>
     <w:p>
@@ -3441,7 +3590,7 @@
           <w:color w:val="475569"/>
           <w:sz w:val="19"/>
         </w:rPr>
-        <w:t>Tabela 3 – Ranking dos 10 municípios com maior número de focos de queimadas no Pará (2020–2024) e posição de Óbidos. Fonte: Compilado pelos autores a partir de dados do INPE (2026).</w:t>
+        <w:t>Tabela 3 – Ranking dos 10 municípios com maior número de focos de queimadas no Pará (2020–2026 até 26/08/2026). Fonte: Compilado pelos autores a partir de dados do INPE (2026).</w:t>
       </w:r>
     </w:p>
     <w:tbl>
@@ -3515,7 +3664,7 @@
                 <w:color w:val="FFFFFF"/>
                 <w:sz w:val="19"/>
               </w:rPr>
-              <w:t>Focos Acumulados (2020–2024)</w:t>
+              <w:t>Focos Acumulados (2020–2026)</w:t>
             </w:r>
           </w:p>
         </w:tc>
@@ -3596,7 +3745,7 @@
                 <w:color w:val="1E293B"/>
                 <w:sz w:val="18"/>
               </w:rPr>
-              <w:t>SÃO FÉLIX DO XINGU</w:t>
+              <w:t>ALTAMIRA</w:t>
             </w:r>
           </w:p>
         </w:tc>
@@ -3615,7 +3764,7 @@
                 <w:color w:val="1E293B"/>
                 <w:sz w:val="18"/>
               </w:rPr>
-              <w:t>22.977</w:t>
+              <w:t>46.778</w:t>
             </w:r>
           </w:p>
         </w:tc>
@@ -3634,7 +3783,7 @@
                 <w:color w:val="1E293B"/>
                 <w:sz w:val="18"/>
               </w:rPr>
-              <w:t>10,52%</w:t>
+              <w:t>12,35%</w:t>
             </w:r>
           </w:p>
         </w:tc>
@@ -3693,7 +3842,7 @@
                 <w:color w:val="1E293B"/>
                 <w:sz w:val="18"/>
               </w:rPr>
-              <w:t>ALTAMIRA</w:t>
+              <w:t>SÃO FÉLIX DO XINGU</w:t>
             </w:r>
           </w:p>
         </w:tc>
@@ -3712,7 +3861,7 @@
                 <w:color w:val="1E293B"/>
                 <w:sz w:val="18"/>
               </w:rPr>
-              <w:t>22.389</w:t>
+              <w:t>32.385</w:t>
             </w:r>
           </w:p>
         </w:tc>
@@ -3731,7 +3880,7 @@
                 <w:color w:val="1E293B"/>
                 <w:sz w:val="18"/>
               </w:rPr>
-              <w:t>10,25%</w:t>
+              <w:t>8,55%</w:t>
             </w:r>
           </w:p>
         </w:tc>
@@ -3790,7 +3939,7 @@
                 <w:color w:val="1E293B"/>
                 <w:sz w:val="18"/>
               </w:rPr>
-              <w:t>NOVO PROGRESSO</w:t>
+              <w:t>ITAITUBA</w:t>
             </w:r>
           </w:p>
         </w:tc>
@@ -3809,7 +3958,7 @@
                 <w:color w:val="1E293B"/>
                 <w:sz w:val="18"/>
               </w:rPr>
-              <w:t>13.473</w:t>
+              <w:t>24.468</w:t>
             </w:r>
           </w:p>
         </w:tc>
@@ -3828,7 +3977,7 @@
                 <w:color w:val="1E293B"/>
                 <w:sz w:val="18"/>
               </w:rPr>
-              <w:t>6,17%</w:t>
+              <w:t>6,46%</w:t>
             </w:r>
           </w:p>
         </w:tc>
@@ -3887,7 +4036,7 @@
                 <w:color w:val="1E293B"/>
                 <w:sz w:val="18"/>
               </w:rPr>
-              <w:t>ITAITUBA</w:t>
+              <w:t>NOVO PROGRESSO</w:t>
             </w:r>
           </w:p>
         </w:tc>
@@ -3906,7 +4055,7 @@
                 <w:color w:val="1E293B"/>
                 <w:sz w:val="18"/>
               </w:rPr>
-              <w:t>9.588</w:t>
+              <w:t>21.894</w:t>
             </w:r>
           </w:p>
         </w:tc>
@@ -3925,7 +4074,7 @@
                 <w:color w:val="1E293B"/>
                 <w:sz w:val="18"/>
               </w:rPr>
-              <w:t>4,39%</w:t>
+              <w:t>5,78%</w:t>
             </w:r>
           </w:p>
         </w:tc>
@@ -3984,7 +4133,7 @@
                 <w:color w:val="1E293B"/>
                 <w:sz w:val="18"/>
               </w:rPr>
-              <w:t>PORTEL</w:t>
+              <w:t>JACAREACANGA</w:t>
             </w:r>
           </w:p>
         </w:tc>
@@ -4003,7 +4152,7 @@
                 <w:color w:val="1E293B"/>
                 <w:sz w:val="18"/>
               </w:rPr>
-              <w:t>7.372</w:t>
+              <w:t>15.270</w:t>
             </w:r>
           </w:p>
         </w:tc>
@@ -4022,7 +4171,7 @@
                 <w:color w:val="1E293B"/>
                 <w:sz w:val="18"/>
               </w:rPr>
-              <w:t>3,37%</w:t>
+              <w:t>4,03%</w:t>
             </w:r>
           </w:p>
         </w:tc>
@@ -4081,7 +4230,7 @@
                 <w:color w:val="1E293B"/>
                 <w:sz w:val="18"/>
               </w:rPr>
-              <w:t>PACAJÁ</w:t>
+              <w:t>PORTEL</w:t>
             </w:r>
           </w:p>
         </w:tc>
@@ -4100,7 +4249,7 @@
                 <w:color w:val="1E293B"/>
                 <w:sz w:val="18"/>
               </w:rPr>
-              <w:t>5.455</w:t>
+              <w:t>9.389</w:t>
             </w:r>
           </w:p>
         </w:tc>
@@ -4119,7 +4268,7 @@
                 <w:color w:val="1E293B"/>
                 <w:sz w:val="18"/>
               </w:rPr>
-              <w:t>2,50%</w:t>
+              <w:t>2,48%</w:t>
             </w:r>
           </w:p>
         </w:tc>
@@ -4178,7 +4327,7 @@
                 <w:color w:val="1E293B"/>
                 <w:sz w:val="18"/>
               </w:rPr>
-              <w:t>JACAREACANGA</w:t>
+              <w:t>PACAJÁ</w:t>
             </w:r>
           </w:p>
         </w:tc>
@@ -4197,7 +4346,7 @@
                 <w:color w:val="1E293B"/>
                 <w:sz w:val="18"/>
               </w:rPr>
-              <w:t>4.770</w:t>
+              <w:t>7.262</w:t>
             </w:r>
           </w:p>
         </w:tc>
@@ -4216,7 +4365,7 @@
                 <w:color w:val="1E293B"/>
                 <w:sz w:val="18"/>
               </w:rPr>
-              <w:t>2,18%</w:t>
+              <w:t>1,92%</w:t>
             </w:r>
           </w:p>
         </w:tc>
@@ -4275,7 +4424,7 @@
                 <w:color w:val="1E293B"/>
                 <w:sz w:val="18"/>
               </w:rPr>
-              <w:t>MOJU</w:t>
+              <w:t>SANTANA DO ARAGUAIA</w:t>
             </w:r>
           </w:p>
         </w:tc>
@@ -4294,7 +4443,7 @@
                 <w:color w:val="1E293B"/>
                 <w:sz w:val="18"/>
               </w:rPr>
-              <w:t>4.510</w:t>
+              <w:t>7.213</w:t>
             </w:r>
           </w:p>
         </w:tc>
@@ -4313,7 +4462,7 @@
                 <w:color w:val="1E293B"/>
                 <w:sz w:val="18"/>
               </w:rPr>
-              <w:t>2,06%</w:t>
+              <w:t>1,90%</w:t>
             </w:r>
           </w:p>
         </w:tc>
@@ -4372,7 +4521,7 @@
                 <w:color w:val="1E293B"/>
                 <w:sz w:val="18"/>
               </w:rPr>
-              <w:t>URUARÁ</w:t>
+              <w:t>MOJU</w:t>
             </w:r>
           </w:p>
         </w:tc>
@@ -4391,7 +4540,7 @@
                 <w:color w:val="1E293B"/>
                 <w:sz w:val="18"/>
               </w:rPr>
-              <w:t>4.034</w:t>
+              <w:t>6.547</w:t>
             </w:r>
           </w:p>
         </w:tc>
@@ -4410,7 +4559,7 @@
                 <w:color w:val="1E293B"/>
                 <w:sz w:val="18"/>
               </w:rPr>
-              <w:t>1,85%</w:t>
+              <w:t>1,73%</w:t>
             </w:r>
           </w:p>
         </w:tc>
@@ -4469,7 +4618,7 @@
                 <w:color w:val="1E293B"/>
                 <w:sz w:val="18"/>
               </w:rPr>
-              <w:t>PLACAS</w:t>
+              <w:t>ÓBIDOS</w:t>
             </w:r>
           </w:p>
         </w:tc>
@@ -4488,7 +4637,7 @@
                 <w:color w:val="1E293B"/>
                 <w:sz w:val="18"/>
               </w:rPr>
-              <w:t>3.508</w:t>
+              <w:t>5.621</w:t>
             </w:r>
           </w:p>
         </w:tc>
@@ -4507,7 +4656,7 @@
                 <w:color w:val="1E293B"/>
                 <w:sz w:val="18"/>
               </w:rPr>
-              <w:t>1,61%</w:t>
+              <w:t>1,48%</w:t>
             </w:r>
           </w:p>
         </w:tc>
@@ -4531,10 +4680,195 @@
           </w:p>
         </w:tc>
       </w:tr>
+    </w:tbl>
+    <w:p>
+      <w:pPr>
+        <w:spacing w:before="0" w:after="160"/>
+      </w:pPr>
+    </w:p>
+    <w:p>
+      <w:pPr>
+        <w:keepNext/>
+        <w:spacing w:before="240" w:after="80"/>
+        <w:jc w:val="left"/>
+      </w:pPr>
+      <w:r>
+        <w:rPr>
+          <w:rFonts w:ascii="Calibri" w:hAnsi="Calibri"/>
+          <w:b/>
+          <w:color w:val="1E3A8A"/>
+          <w:sz w:val="24"/>
+        </w:rPr>
+        <w:t>5.4 Análise Territorial em Óbidos: Assentamentos, Quilombolas, UCs e Áreas Indígenas</w:t>
+      </w:r>
+    </w:p>
+    <w:p>
+      <w:pPr>
+        <w:spacing w:line="288" w:lineRule="auto" w:after="120"/>
+        <w:jc w:val="both"/>
+      </w:pPr>
+      <w:r>
+        <w:rPr>
+          <w:i w:val="0"/>
+          <w:color w:val="1E293B"/>
+          <w:sz w:val="22"/>
+        </w:rPr>
+        <w:t>A estratificação fundiária e socioambiental dos 5.621 focos registrados em Óbidos permitiu mapear com exatidão onde incidem as maiores pressões de fogo no município. A Tabela 4 apresenta a distribuição por categoria territorial.</w:t>
+      </w:r>
+    </w:p>
+    <w:p>
+      <w:pPr>
+        <w:keepNext/>
+        <w:spacing w:before="200" w:after="80"/>
+        <w:jc w:val="center"/>
+      </w:pPr>
+      <w:r>
+        <w:rPr>
+          <w:b/>
+          <w:color w:val="475569"/>
+          <w:sz w:val="19"/>
+        </w:rPr>
+        <w:t>Tabela 4 – Estratificação de focos de queimadas por categoria territorial no município de Óbidos (2020–2026). Fonte: Autores (2026).</w:t>
+      </w:r>
+    </w:p>
+    <w:tbl>
+      <w:tblPr>
+        <w:tblW w:type="auto" w:w="0"/>
+        <w:jc w:val="center"/>
+        <w:tblLayout w:type="fixed"/>
+        <w:tblLook w:firstColumn="1" w:firstRow="1" w:lastColumn="0" w:lastRow="0" w:noHBand="0" w:noVBand="1" w:val="04A0"/>
+      </w:tblPr>
+      <w:tblGrid>
+        <w:gridCol w:w="2354"/>
+        <w:gridCol w:w="2354"/>
+        <w:gridCol w:w="2354"/>
+        <w:gridCol w:w="2354"/>
+      </w:tblGrid>
       <w:tr>
         <w:tc>
           <w:tcPr>
-            <w:tcW w:type="dxa" w:w="1152"/>
+            <w:tcW w:type="dxa" w:w="2160"/>
+            <w:shd w:fill="1E3A8A"/>
+          </w:tcPr>
+          <w:p>
+            <w:pPr>
+              <w:spacing w:before="80" w:after="80"/>
+              <w:jc w:val="center"/>
+            </w:pPr>
+            <w:r>
+              <w:rPr>
+                <w:b/>
+                <w:color w:val="FFFFFF"/>
+                <w:sz w:val="19"/>
+              </w:rPr>
+              <w:t>Categoria Territorial Fundiária</w:t>
+            </w:r>
+          </w:p>
+        </w:tc>
+        <w:tc>
+          <w:tcPr>
+            <w:tcW w:type="dxa" w:w="1728"/>
+            <w:shd w:fill="1E3A8A"/>
+          </w:tcPr>
+          <w:p>
+            <w:pPr>
+              <w:spacing w:before="80" w:after="80"/>
+              <w:jc w:val="center"/>
+            </w:pPr>
+            <w:r>
+              <w:rPr>
+                <w:b/>
+                <w:color w:val="FFFFFF"/>
+                <w:sz w:val="19"/>
+              </w:rPr>
+              <w:t>Total de Focos (2020–2026)</w:t>
+            </w:r>
+          </w:p>
+        </w:tc>
+        <w:tc>
+          <w:tcPr>
+            <w:tcW w:type="dxa" w:w="1728"/>
+            <w:shd w:fill="1E3A8A"/>
+          </w:tcPr>
+          <w:p>
+            <w:pPr>
+              <w:spacing w:before="80" w:after="80"/>
+              <w:jc w:val="center"/>
+            </w:pPr>
+            <w:r>
+              <w:rPr>
+                <w:b/>
+                <w:color w:val="FFFFFF"/>
+                <w:sz w:val="19"/>
+              </w:rPr>
+              <w:t>Participação Relativa (%)</w:t>
+            </w:r>
+          </w:p>
+        </w:tc>
+        <w:tc>
+          <w:tcPr>
+            <w:tcW w:type="dxa" w:w="3312"/>
+            <w:shd w:fill="1E3A8A"/>
+          </w:tcPr>
+          <w:p>
+            <w:pPr>
+              <w:spacing w:before="80" w:after="80"/>
+              <w:jc w:val="center"/>
+            </w:pPr>
+            <w:r>
+              <w:rPr>
+                <w:b/>
+                <w:color w:val="FFFFFF"/>
+                <w:sz w:val="19"/>
+              </w:rPr>
+              <w:t>Principais Áreas Afetadas</w:t>
+            </w:r>
+          </w:p>
+        </w:tc>
+      </w:tr>
+      <w:tr>
+        <w:tc>
+          <w:tcPr>
+            <w:tcW w:type="dxa" w:w="2160"/>
+            <w:shd w:fill="FFFFFF"/>
+          </w:tcPr>
+          <w:p>
+            <w:pPr>
+              <w:spacing w:before="60" w:after="60"/>
+              <w:jc w:val="center"/>
+            </w:pPr>
+            <w:r>
+              <w:rPr>
+                <w:b/>
+                <w:color w:val="1E293B"/>
+                <w:sz w:val="18"/>
+              </w:rPr>
+              <w:t>Território Quilombola (TQ)</w:t>
+            </w:r>
+          </w:p>
+        </w:tc>
+        <w:tc>
+          <w:tcPr>
+            <w:tcW w:type="dxa" w:w="1728"/>
+            <w:shd w:fill="FFFFFF"/>
+          </w:tcPr>
+          <w:p>
+            <w:pPr>
+              <w:spacing w:before="60" w:after="60"/>
+              <w:jc w:val="left"/>
+            </w:pPr>
+            <w:r>
+              <w:rPr>
+                <w:color w:val="1E293B"/>
+                <w:sz w:val="18"/>
+              </w:rPr>
+              <w:t>2.526</w:t>
+            </w:r>
+          </w:p>
+        </w:tc>
+        <w:tc>
+          <w:tcPr>
+            <w:tcW w:type="dxa" w:w="1728"/>
             <w:shd w:fill="FFFFFF"/>
           </w:tcPr>
           <w:p>
@@ -4547,13 +4881,131 @@
                 <w:color w:val="1E293B"/>
                 <w:sz w:val="18"/>
               </w:rPr>
-              <w:t>#11</w:t>
+              <w:t>44,94%</w:t>
             </w:r>
           </w:p>
         </w:tc>
         <w:tc>
           <w:tcPr>
-            <w:tcW w:type="dxa" w:w="2880"/>
+            <w:tcW w:type="dxa" w:w="3312"/>
+            <w:shd w:fill="FFFFFF"/>
+          </w:tcPr>
+          <w:p>
+            <w:pPr>
+              <w:spacing w:before="60" w:after="60"/>
+              <w:jc w:val="center"/>
+            </w:pPr>
+            <w:r>
+              <w:rPr>
+                <w:color w:val="1E293B"/>
+                <w:sz w:val="18"/>
+              </w:rPr>
+              <w:t>TQ Alto Trombetas, Silêncio, Muratubinha, Mondongo, Arapucu</w:t>
+            </w:r>
+          </w:p>
+        </w:tc>
+      </w:tr>
+      <w:tr>
+        <w:tc>
+          <w:tcPr>
+            <w:tcW w:type="dxa" w:w="2160"/>
+            <w:shd w:fill="F8FAFC"/>
+          </w:tcPr>
+          <w:p>
+            <w:pPr>
+              <w:spacing w:before="60" w:after="60"/>
+              <w:jc w:val="center"/>
+            </w:pPr>
+            <w:r>
+              <w:rPr>
+                <w:color w:val="1E293B"/>
+                <w:sz w:val="18"/>
+              </w:rPr>
+              <w:t>Terra Indígena (TI)</w:t>
+            </w:r>
+          </w:p>
+        </w:tc>
+        <w:tc>
+          <w:tcPr>
+            <w:tcW w:type="dxa" w:w="1728"/>
+            <w:shd w:fill="F8FAFC"/>
+          </w:tcPr>
+          <w:p>
+            <w:pPr>
+              <w:spacing w:before="60" w:after="60"/>
+              <w:jc w:val="left"/>
+            </w:pPr>
+            <w:r>
+              <w:rPr>
+                <w:color w:val="1E293B"/>
+                <w:sz w:val="18"/>
+              </w:rPr>
+              <w:t>1.368</w:t>
+            </w:r>
+          </w:p>
+        </w:tc>
+        <w:tc>
+          <w:tcPr>
+            <w:tcW w:type="dxa" w:w="1728"/>
+            <w:shd w:fill="F8FAFC"/>
+          </w:tcPr>
+          <w:p>
+            <w:pPr>
+              <w:spacing w:before="60" w:after="60"/>
+              <w:jc w:val="center"/>
+            </w:pPr>
+            <w:r>
+              <w:rPr>
+                <w:color w:val="1E293B"/>
+                <w:sz w:val="18"/>
+              </w:rPr>
+              <w:t>24,34%</w:t>
+            </w:r>
+          </w:p>
+        </w:tc>
+        <w:tc>
+          <w:tcPr>
+            <w:tcW w:type="dxa" w:w="3312"/>
+            <w:shd w:fill="F8FAFC"/>
+          </w:tcPr>
+          <w:p>
+            <w:pPr>
+              <w:spacing w:before="60" w:after="60"/>
+              <w:jc w:val="center"/>
+            </w:pPr>
+            <w:r>
+              <w:rPr>
+                <w:color w:val="1E293B"/>
+                <w:sz w:val="18"/>
+              </w:rPr>
+              <w:t>TI Zo'é, TI Kaxuyana-Tunayana, TI Trombetas-Mapuera</w:t>
+            </w:r>
+          </w:p>
+        </w:tc>
+      </w:tr>
+      <w:tr>
+        <w:tc>
+          <w:tcPr>
+            <w:tcW w:type="dxa" w:w="2160"/>
+            <w:shd w:fill="FFFFFF"/>
+          </w:tcPr>
+          <w:p>
+            <w:pPr>
+              <w:spacing w:before="60" w:after="60"/>
+              <w:jc w:val="center"/>
+            </w:pPr>
+            <w:r>
+              <w:rPr>
+                <w:color w:val="1E293B"/>
+                <w:sz w:val="18"/>
+              </w:rPr>
+              <w:t>Projeto de Assentamento (PA/PAE)</w:t>
+            </w:r>
+          </w:p>
+        </w:tc>
+        <w:tc>
+          <w:tcPr>
+            <w:tcW w:type="dxa" w:w="1728"/>
             <w:shd w:fill="FFFFFF"/>
           </w:tcPr>
           <w:p>
@@ -4566,13 +5018,13 @@
                 <w:color w:val="1E293B"/>
                 <w:sz w:val="18"/>
               </w:rPr>
-              <w:t>ÓBIDOS</w:t>
+              <w:t>761</w:t>
             </w:r>
           </w:p>
         </w:tc>
         <w:tc>
           <w:tcPr>
-            <w:tcW w:type="dxa" w:w="2304"/>
+            <w:tcW w:type="dxa" w:w="1728"/>
             <w:shd w:fill="FFFFFF"/>
           </w:tcPr>
           <w:p>
@@ -4585,13 +5037,13 @@
                 <w:color w:val="1E293B"/>
                 <w:sz w:val="18"/>
               </w:rPr>
-              <w:t>3.374</w:t>
+              <w:t>13,54%</w:t>
             </w:r>
           </w:p>
         </w:tc>
         <w:tc>
           <w:tcPr>
-            <w:tcW w:type="dxa" w:w="2016"/>
+            <w:tcW w:type="dxa" w:w="3312"/>
             <w:shd w:fill="FFFFFF"/>
           </w:tcPr>
           <w:p>
@@ -4604,13 +5056,93 @@
                 <w:color w:val="1E293B"/>
                 <w:sz w:val="18"/>
               </w:rPr>
-              <w:t>1,54%</w:t>
+              <w:t>PAE Lago Grande, PAE Curumu, PAE Salvação, PA Serra Azul</w:t>
+            </w:r>
+          </w:p>
+        </w:tc>
+      </w:tr>
+      <w:tr>
+        <w:tc>
+          <w:tcPr>
+            <w:tcW w:type="dxa" w:w="2160"/>
+            <w:shd w:fill="F8FAFC"/>
+          </w:tcPr>
+          <w:p>
+            <w:pPr>
+              <w:spacing w:before="60" w:after="60"/>
+              <w:jc w:val="center"/>
+            </w:pPr>
+            <w:r>
+              <w:rPr>
+                <w:color w:val="1E293B"/>
+                <w:sz w:val="18"/>
+              </w:rPr>
+              <w:t>Unidade de Conservação (UC)</w:t>
             </w:r>
           </w:p>
         </w:tc>
         <w:tc>
           <w:tcPr>
-            <w:tcW w:type="dxa" w:w="1440"/>
+            <w:tcW w:type="dxa" w:w="1728"/>
+            <w:shd w:fill="F8FAFC"/>
+          </w:tcPr>
+          <w:p>
+            <w:pPr>
+              <w:spacing w:before="60" w:after="60"/>
+              <w:jc w:val="left"/>
+            </w:pPr>
+            <w:r>
+              <w:rPr>
+                <w:color w:val="1E293B"/>
+                <w:sz w:val="18"/>
+              </w:rPr>
+              <w:t>683</w:t>
+            </w:r>
+          </w:p>
+        </w:tc>
+        <w:tc>
+          <w:tcPr>
+            <w:tcW w:type="dxa" w:w="1728"/>
+            <w:shd w:fill="F8FAFC"/>
+          </w:tcPr>
+          <w:p>
+            <w:pPr>
+              <w:spacing w:before="60" w:after="60"/>
+              <w:jc w:val="center"/>
+            </w:pPr>
+            <w:r>
+              <w:rPr>
+                <w:color w:val="1E293B"/>
+                <w:sz w:val="18"/>
+              </w:rPr>
+              <w:t>12,15%</w:t>
+            </w:r>
+          </w:p>
+        </w:tc>
+        <w:tc>
+          <w:tcPr>
+            <w:tcW w:type="dxa" w:w="3312"/>
+            <w:shd w:fill="F8FAFC"/>
+          </w:tcPr>
+          <w:p>
+            <w:pPr>
+              <w:spacing w:before="60" w:after="60"/>
+              <w:jc w:val="center"/>
+            </w:pPr>
+            <w:r>
+              <w:rPr>
+                <w:color w:val="1E293B"/>
+                <w:sz w:val="18"/>
+              </w:rPr>
+              <w:t>FLOTA Trombetas (671 focos) e FLOTA Faro (12 focos)</w:t>
+            </w:r>
+          </w:p>
+        </w:tc>
+      </w:tr>
+      <w:tr>
+        <w:tc>
+          <w:tcPr>
+            <w:tcW w:type="dxa" w:w="2160"/>
             <w:shd w:fill="FFFFFF"/>
           </w:tcPr>
           <w:p>
@@ -4623,7 +5155,142 @@
                 <w:color w:val="1E293B"/>
                 <w:sz w:val="18"/>
               </w:rPr>
-              <w:t>Amazônia</w:t>
+              <w:t>Área Privada / Outras Áreas</w:t>
+            </w:r>
+          </w:p>
+        </w:tc>
+        <w:tc>
+          <w:tcPr>
+            <w:tcW w:type="dxa" w:w="1728"/>
+            <w:shd w:fill="FFFFFF"/>
+          </w:tcPr>
+          <w:p>
+            <w:pPr>
+              <w:spacing w:before="60" w:after="60"/>
+              <w:jc w:val="left"/>
+            </w:pPr>
+            <w:r>
+              <w:rPr>
+                <w:color w:val="1E293B"/>
+                <w:sz w:val="18"/>
+              </w:rPr>
+              <w:t>283</w:t>
+            </w:r>
+          </w:p>
+        </w:tc>
+        <w:tc>
+          <w:tcPr>
+            <w:tcW w:type="dxa" w:w="1728"/>
+            <w:shd w:fill="FFFFFF"/>
+          </w:tcPr>
+          <w:p>
+            <w:pPr>
+              <w:spacing w:before="60" w:after="60"/>
+              <w:jc w:val="center"/>
+            </w:pPr>
+            <w:r>
+              <w:rPr>
+                <w:color w:val="1E293B"/>
+                <w:sz w:val="18"/>
+              </w:rPr>
+              <w:t>5,03%</w:t>
+            </w:r>
+          </w:p>
+        </w:tc>
+        <w:tc>
+          <w:tcPr>
+            <w:tcW w:type="dxa" w:w="3312"/>
+            <w:shd w:fill="FFFFFF"/>
+          </w:tcPr>
+          <w:p>
+            <w:pPr>
+              <w:spacing w:before="60" w:after="60"/>
+              <w:jc w:val="center"/>
+            </w:pPr>
+            <w:r>
+              <w:rPr>
+                <w:color w:val="1E293B"/>
+                <w:sz w:val="18"/>
+              </w:rPr>
+              <w:t>Zona urbana, sede municipal e propriedades rurais ribeirinhas</w:t>
+            </w:r>
+          </w:p>
+        </w:tc>
+      </w:tr>
+      <w:tr>
+        <w:tc>
+          <w:tcPr>
+            <w:tcW w:type="dxa" w:w="2160"/>
+            <w:shd w:fill="F8FAFC"/>
+          </w:tcPr>
+          <w:p>
+            <w:pPr>
+              <w:spacing w:before="60" w:after="60"/>
+              <w:jc w:val="center"/>
+            </w:pPr>
+            <w:r>
+              <w:rPr>
+                <w:color w:val="1E293B"/>
+                <w:sz w:val="18"/>
+              </w:rPr>
+              <w:t>Total Consolidado</w:t>
+            </w:r>
+          </w:p>
+        </w:tc>
+        <w:tc>
+          <w:tcPr>
+            <w:tcW w:type="dxa" w:w="1728"/>
+            <w:shd w:fill="F8FAFC"/>
+          </w:tcPr>
+          <w:p>
+            <w:pPr>
+              <w:spacing w:before="60" w:after="60"/>
+              <w:jc w:val="left"/>
+            </w:pPr>
+            <w:r>
+              <w:rPr>
+                <w:color w:val="1E293B"/>
+                <w:sz w:val="18"/>
+              </w:rPr>
+              <w:t>5.621</w:t>
+            </w:r>
+          </w:p>
+        </w:tc>
+        <w:tc>
+          <w:tcPr>
+            <w:tcW w:type="dxa" w:w="1728"/>
+            <w:shd w:fill="F8FAFC"/>
+          </w:tcPr>
+          <w:p>
+            <w:pPr>
+              <w:spacing w:before="60" w:after="60"/>
+              <w:jc w:val="center"/>
+            </w:pPr>
+            <w:r>
+              <w:rPr>
+                <w:color w:val="1E293B"/>
+                <w:sz w:val="18"/>
+              </w:rPr>
+              <w:t>100,00%</w:t>
+            </w:r>
+          </w:p>
+        </w:tc>
+        <w:tc>
+          <w:tcPr>
+            <w:tcW w:type="dxa" w:w="3312"/>
+            <w:shd w:fill="F8FAFC"/>
+          </w:tcPr>
+          <w:p>
+            <w:pPr>
+              <w:spacing w:before="60" w:after="60"/>
+              <w:jc w:val="center"/>
+            </w:pPr>
+            <w:r>
+              <w:rPr>
+                <w:color w:val="1E293B"/>
+                <w:sz w:val="18"/>
+              </w:rPr>
+              <w:t>Município de Óbidos (PA)</w:t>
             </w:r>
           </w:p>
         </w:tc>
@@ -4633,6 +5300,144 @@
       <w:pPr>
         <w:spacing w:before="0" w:after="160"/>
       </w:pPr>
+    </w:p>
+    <w:p>
+      <w:pPr>
+        <w:spacing w:line="288" w:lineRule="auto" w:after="120"/>
+        <w:jc w:val="both"/>
+      </w:pPr>
+      <w:r>
+        <w:rPr>
+          <w:i w:val="0"/>
+          <w:color w:val="1E293B"/>
+          <w:sz w:val="22"/>
+        </w:rPr>
+        <w:t>A Figura 12 apresenta o gráfico de barras horizontais dos focos por categoria territorial em Óbidos, e a Figura 13 ilustra a partição percentual em gráfico de rosca.</w:t>
+      </w:r>
+    </w:p>
+    <w:p>
+      <w:pPr>
+        <w:keepNext/>
+        <w:spacing w:before="200" w:after="80"/>
+        <w:jc w:val="center"/>
+      </w:pPr>
+      <w:r>
+        <w:drawing>
+          <wp:inline xmlns:a="http://schemas.openxmlformats.org/drawingml/2006/main" xmlns:pic="http://schemas.openxmlformats.org/drawingml/2006/picture">
+            <wp:extent cx="5303520" cy="2617923"/>
+            <wp:docPr id="12" name="Picture 12"/>
+            <wp:cNvGraphicFramePr>
+              <a:graphicFrameLocks noChangeAspect="1"/>
+            </wp:cNvGraphicFramePr>
+            <a:graphic>
+              <a:graphicData uri="http://schemas.openxmlformats.org/drawingml/2006/picture">
+                <pic:pic>
+                  <pic:nvPicPr>
+                    <pic:cNvPr id="0" name="obidos_territorios_barras.png"/>
+                    <pic:cNvPicPr/>
+                  </pic:nvPicPr>
+                  <pic:blipFill>
+                    <a:blip r:embed="rId20"/>
+                    <a:stretch>
+                      <a:fillRect/>
+                    </a:stretch>
+                  </pic:blipFill>
+                  <pic:spPr>
+                    <a:xfrm>
+                      <a:off x="0" y="0"/>
+                      <a:ext cx="5303520" cy="2617923"/>
+                    </a:xfrm>
+                    <a:prstGeom prst="rect"/>
+                  </pic:spPr>
+                </pic:pic>
+              </a:graphicData>
+            </a:graphic>
+          </wp:inline>
+        </w:drawing>
+      </w:r>
+    </w:p>
+    <w:p>
+      <w:pPr>
+        <w:spacing w:before="0" w:after="240"/>
+        <w:jc w:val="center"/>
+      </w:pPr>
+      <w:r>
+        <w:rPr>
+          <w:b/>
+          <w:color w:val="475569"/>
+          <w:sz w:val="19"/>
+        </w:rPr>
+        <w:t>Figura 12 – Focos de queimadas por categoria territorial em Óbidos (2020–2026). Fonte: Gerado pelo pipeline scripts/graficos.py (2026).</w:t>
+      </w:r>
+    </w:p>
+    <w:p>
+      <w:pPr>
+        <w:keepNext/>
+        <w:spacing w:before="200" w:after="80"/>
+        <w:jc w:val="center"/>
+      </w:pPr>
+      <w:r>
+        <w:drawing>
+          <wp:inline xmlns:a="http://schemas.openxmlformats.org/drawingml/2006/main" xmlns:pic="http://schemas.openxmlformats.org/drawingml/2006/picture">
+            <wp:extent cx="4754880" cy="3440776"/>
+            <wp:docPr id="13" name="Picture 13"/>
+            <wp:cNvGraphicFramePr>
+              <a:graphicFrameLocks noChangeAspect="1"/>
+            </wp:cNvGraphicFramePr>
+            <a:graphic>
+              <a:graphicData uri="http://schemas.openxmlformats.org/drawingml/2006/picture">
+                <pic:pic>
+                  <pic:nvPicPr>
+                    <pic:cNvPr id="0" name="obidos_territorios_pizza.png"/>
+                    <pic:cNvPicPr/>
+                  </pic:nvPicPr>
+                  <pic:blipFill>
+                    <a:blip r:embed="rId21"/>
+                    <a:stretch>
+                      <a:fillRect/>
+                    </a:stretch>
+                  </pic:blipFill>
+                  <pic:spPr>
+                    <a:xfrm>
+                      <a:off x="0" y="0"/>
+                      <a:ext cx="4754880" cy="3440776"/>
+                    </a:xfrm>
+                    <a:prstGeom prst="rect"/>
+                  </pic:spPr>
+                </pic:pic>
+              </a:graphicData>
+            </a:graphic>
+          </wp:inline>
+        </w:drawing>
+      </w:r>
+    </w:p>
+    <w:p>
+      <w:pPr>
+        <w:spacing w:before="0" w:after="240"/>
+        <w:jc w:val="center"/>
+      </w:pPr>
+      <w:r>
+        <w:rPr>
+          <w:b/>
+          <w:color w:val="475569"/>
+          <w:sz w:val="19"/>
+        </w:rPr>
+        <w:t>Figura 13 – Participação percentual de queimadas por destinação fundiária em Óbidos. Fonte: Gerado pelo pipeline scripts/graficos.py (2026).</w:t>
+      </w:r>
+    </w:p>
+    <w:p>
+      <w:pPr>
+        <w:spacing w:line="288" w:lineRule="auto" w:after="120"/>
+        <w:jc w:val="both"/>
+      </w:pPr>
+      <w:r>
+        <w:rPr>
+          <w:i w:val="0"/>
+          <w:color w:val="1E293B"/>
+          <w:sz w:val="22"/>
+        </w:rPr>
+        <w:t>Os dados revelam que as áreas comunitárias tradicionais (Territórios Quilombolas e Projetos de Assentamento Agroextrativista) e as bordas de Terras Indígenas concentram expressiva atividade de fogo, demandando ações de manejo integrado do fogo, fortalecimento de brigadas comunitárias e assistência técnica para alternativas agrícolas sustentáveis.</w:t>
+      </w:r>
     </w:p>
     <w:p>
       <w:pPr>
@@ -4658,7 +5463,7 @@
         <w:drawing>
           <wp:inline xmlns:a="http://schemas.openxmlformats.org/drawingml/2006/main" xmlns:pic="http://schemas.openxmlformats.org/drawingml/2006/picture">
             <wp:extent cx="5303520" cy="2624975"/>
-            <wp:docPr id="13" name="Picture 13"/>
+            <wp:docPr id="14" name="Picture 14"/>
             <wp:cNvGraphicFramePr>
               <a:graphicFrameLocks noChangeAspect="1"/>
             </wp:cNvGraphicFramePr>
@@ -4670,7 +5475,7 @@
                     <pic:cNvPicPr/>
                   </pic:nvPicPr>
                   <pic:blipFill>
-                    <a:blip r:embed="rId21"/>
+                    <a:blip r:embed="rId22"/>
                     <a:stretch>
                       <a:fillRect/>
                     </a:stretch>
@@ -4727,7 +5532,7 @@
         <w:drawing>
           <wp:inline xmlns:a="http://schemas.openxmlformats.org/drawingml/2006/main" xmlns:pic="http://schemas.openxmlformats.org/drawingml/2006/picture">
             <wp:extent cx="5303520" cy="2627432"/>
-            <wp:docPr id="14" name="Picture 14"/>
+            <wp:docPr id="15" name="Picture 15"/>
             <wp:cNvGraphicFramePr>
               <a:graphicFrameLocks noChangeAspect="1"/>
             </wp:cNvGraphicFramePr>
@@ -4739,7 +5544,7 @@
                     <pic:cNvPicPr/>
                   </pic:nvPicPr>
                   <pic:blipFill>
-                    <a:blip r:embed="rId22"/>
+                    <a:blip r:embed="rId23"/>
                     <a:stretch>
                       <a:fillRect/>
                     </a:stretch>

</xml_diff>

<commit_message>
feat(territorios): restringir territorializacao exclusivamente aos 27 territorios solicitados em Obidos
- Atualizar classificador espacial para as 27 areas oficiais: PA Curumu II, ESEC Grao-Para, FLOTA Paru, FLOTA Trombetas, Parna Tumucumaque, Zoe, PA Cipoal, PA Mamuru, PAE Maria Tereza, PAE Vale do Salgado, PDS Maloca, PAC Monte Muria, PAE Parana Dona Rosa, PAE Tres Ilhas, PA Vale do Acai, PAC Itapecuru, PAC Ananizal, PAE Cachoery, PA Repartimento, PAQ Erepecuru, PAE Costa Fronteira, PAE Paru, PAE Cacoal Grande, PAE Madalena, PAQ Cabaceiras, PAE Parana de Baixo e PA Cruzeirao
- Atualizar tabelas estratificadas em outputs/analise/
- Regenerar graficos de barras e pizza territoriais
- Recompilar relatorio tecnico oficial PDF e artigo academico DOCX
</commit_message>
<xml_diff>
--- a/Projeto_Queimadas_Artigo.docx
+++ b/Projeto_Queimadas_Artigo.docx
@@ -4728,7 +4728,7 @@
           <w:color w:val="475569"/>
           <w:sz w:val="19"/>
         </w:rPr>
-        <w:t>Tabela 4 – Estratificação de focos de queimadas por categoria territorial no município de Óbidos (2020–2026). Fonte: Autores (2026).</w:t>
+        <w:t>Tabela 4 – Estratificação de focos de queimadas nos 27 territórios oficiais de Óbidos (2020–2026). Fonte: Autores (2026).</w:t>
       </w:r>
     </w:p>
     <w:tbl>
@@ -4767,7 +4767,7 @@
         </w:tc>
         <w:tc>
           <w:tcPr>
-            <w:tcW w:type="dxa" w:w="1728"/>
+            <w:tcW w:type="dxa" w:w="1584"/>
             <w:shd w:fill="1E3A8A"/>
           </w:tcPr>
           <w:p>
@@ -4787,7 +4787,7 @@
         </w:tc>
         <w:tc>
           <w:tcPr>
-            <w:tcW w:type="dxa" w:w="1728"/>
+            <w:tcW w:type="dxa" w:w="1584"/>
             <w:shd w:fill="1E3A8A"/>
           </w:tcPr>
           <w:p>
@@ -4807,7 +4807,7 @@
         </w:tc>
         <w:tc>
           <w:tcPr>
-            <w:tcW w:type="dxa" w:w="3312"/>
+            <w:tcW w:type="dxa" w:w="3600"/>
             <w:shd w:fill="1E3A8A"/>
           </w:tcPr>
           <w:p>
@@ -4821,7 +4821,7 @@
                 <w:color w:val="FFFFFF"/>
                 <w:sz w:val="19"/>
               </w:rPr>
-              <w:t>Principais Áreas Afetadas</w:t>
+              <w:t>Territórios Mapeados (27 Áreas Oficiais)</w:t>
             </w:r>
           </w:p>
         </w:tc>
@@ -4843,13 +4843,13 @@
                 <w:color w:val="1E293B"/>
                 <w:sz w:val="18"/>
               </w:rPr>
-              <w:t>Território Quilombola (TQ)</w:t>
+              <w:t>Projetos de Assentamento (PA/PAE/PAC/PDS)</w:t>
             </w:r>
           </w:p>
         </w:tc>
         <w:tc>
           <w:tcPr>
-            <w:tcW w:type="dxa" w:w="1728"/>
+            <w:tcW w:type="dxa" w:w="1584"/>
             <w:shd w:fill="FFFFFF"/>
           </w:tcPr>
           <w:p>
@@ -4862,13 +4862,13 @@
                 <w:color w:val="1E293B"/>
                 <w:sz w:val="18"/>
               </w:rPr>
-              <w:t>2.526</w:t>
+              <w:t>2.499</w:t>
             </w:r>
           </w:p>
         </w:tc>
         <w:tc>
           <w:tcPr>
-            <w:tcW w:type="dxa" w:w="1728"/>
+            <w:tcW w:type="dxa" w:w="1584"/>
             <w:shd w:fill="FFFFFF"/>
           </w:tcPr>
           <w:p>
@@ -4881,13 +4881,13 @@
                 <w:color w:val="1E293B"/>
                 <w:sz w:val="18"/>
               </w:rPr>
-              <w:t>44,94%</w:t>
+              <w:t>44,46%</w:t>
             </w:r>
           </w:p>
         </w:tc>
         <w:tc>
           <w:tcPr>
-            <w:tcW w:type="dxa" w:w="3312"/>
+            <w:tcW w:type="dxa" w:w="3600"/>
             <w:shd w:fill="FFFFFF"/>
           </w:tcPr>
           <w:p>
@@ -4900,7 +4900,7 @@
                 <w:color w:val="1E293B"/>
                 <w:sz w:val="18"/>
               </w:rPr>
-              <w:t>TQ Alto Trombetas, Silêncio, Muratubinha, Mondongo, Arapucu</w:t>
+              <w:t>PAE Cachoery (619), PAE Paru (373), PAE Vale do Salgado (343), PA Vale do Açaí (289), PDS Maloca (265), PA Curumu II (153), PA Cipoal (108), PA Repartimento (107), PAE Cacoal Grande, etc.</w:t>
             </w:r>
           </w:p>
         </w:tc>
@@ -4921,13 +4921,13 @@
                 <w:color w:val="1E293B"/>
                 <w:sz w:val="18"/>
               </w:rPr>
-              <w:t>Terra Indígena (TI)</w:t>
+              <w:t>Unidades de Conservação (UC)</w:t>
             </w:r>
           </w:p>
         </w:tc>
         <w:tc>
           <w:tcPr>
-            <w:tcW w:type="dxa" w:w="1728"/>
+            <w:tcW w:type="dxa" w:w="1584"/>
             <w:shd w:fill="F8FAFC"/>
           </w:tcPr>
           <w:p>
@@ -4940,13 +4940,13 @@
                 <w:color w:val="1E293B"/>
                 <w:sz w:val="18"/>
               </w:rPr>
-              <w:t>1.368</w:t>
+              <w:t>1.706</w:t>
             </w:r>
           </w:p>
         </w:tc>
         <w:tc>
           <w:tcPr>
-            <w:tcW w:type="dxa" w:w="1728"/>
+            <w:tcW w:type="dxa" w:w="1584"/>
             <w:shd w:fill="F8FAFC"/>
           </w:tcPr>
           <w:p>
@@ -4959,13 +4959,13 @@
                 <w:color w:val="1E293B"/>
                 <w:sz w:val="18"/>
               </w:rPr>
-              <w:t>24,34%</w:t>
+              <w:t>30,35%</w:t>
             </w:r>
           </w:p>
         </w:tc>
         <w:tc>
           <w:tcPr>
-            <w:tcW w:type="dxa" w:w="3312"/>
+            <w:tcW w:type="dxa" w:w="3600"/>
             <w:shd w:fill="F8FAFC"/>
           </w:tcPr>
           <w:p>
@@ -4978,7 +4978,7 @@
                 <w:color w:val="1E293B"/>
                 <w:sz w:val="18"/>
               </w:rPr>
-              <w:t>TI Zo'é, TI Kaxuyana-Tunayana, TI Trombetas-Mapuera</w:t>
+              <w:t>Parque do Tumucumaque (1.356), FLORESTA ESTADUAL DO TROMBETAS (348), ESEC Grão-Pará (2) e FLOTA Paru</w:t>
             </w:r>
           </w:p>
         </w:tc>
@@ -4999,13 +4999,13 @@
                 <w:color w:val="1E293B"/>
                 <w:sz w:val="18"/>
               </w:rPr>
-              <w:t>Projeto de Assentamento (PA/PAE)</w:t>
+              <w:t>Áreas Quilombolas (PAQ)</w:t>
             </w:r>
           </w:p>
         </w:tc>
         <w:tc>
           <w:tcPr>
-            <w:tcW w:type="dxa" w:w="1728"/>
+            <w:tcW w:type="dxa" w:w="1584"/>
             <w:shd w:fill="FFFFFF"/>
           </w:tcPr>
           <w:p>
@@ -5018,13 +5018,13 @@
                 <w:color w:val="1E293B"/>
                 <w:sz w:val="18"/>
               </w:rPr>
-              <w:t>761</w:t>
+              <w:t>1.415</w:t>
             </w:r>
           </w:p>
         </w:tc>
         <w:tc>
           <w:tcPr>
-            <w:tcW w:type="dxa" w:w="1728"/>
+            <w:tcW w:type="dxa" w:w="1584"/>
             <w:shd w:fill="FFFFFF"/>
           </w:tcPr>
           <w:p>
@@ -5037,13 +5037,13 @@
                 <w:color w:val="1E293B"/>
                 <w:sz w:val="18"/>
               </w:rPr>
-              <w:t>13,54%</w:t>
+              <w:t>25,17%</w:t>
             </w:r>
           </w:p>
         </w:tc>
         <w:tc>
           <w:tcPr>
-            <w:tcW w:type="dxa" w:w="3312"/>
+            <w:tcW w:type="dxa" w:w="3600"/>
             <w:shd w:fill="FFFFFF"/>
           </w:tcPr>
           <w:p>
@@ -5056,7 +5056,7 @@
                 <w:color w:val="1E293B"/>
                 <w:sz w:val="18"/>
               </w:rPr>
-              <w:t>PAE Lago Grande, PAE Curumu, PAE Salvação, PA Serra Azul</w:t>
+              <w:t>PAQ ESPECIAL QUILOMBOLA ÁREA DAS CABECEIRAS (1.071) e PAQ ESPECIAL QUILOMBOLA EREPECURÚ (344)</w:t>
             </w:r>
           </w:p>
         </w:tc>
@@ -5077,13 +5077,13 @@
                 <w:color w:val="1E293B"/>
                 <w:sz w:val="18"/>
               </w:rPr>
-              <w:t>Unidade de Conservação (UC)</w:t>
+              <w:t>Terras Indígenas (TI)</w:t>
             </w:r>
           </w:p>
         </w:tc>
         <w:tc>
           <w:tcPr>
-            <w:tcW w:type="dxa" w:w="1728"/>
+            <w:tcW w:type="dxa" w:w="1584"/>
             <w:shd w:fill="F8FAFC"/>
           </w:tcPr>
           <w:p>
@@ -5096,13 +5096,13 @@
                 <w:color w:val="1E293B"/>
                 <w:sz w:val="18"/>
               </w:rPr>
-              <w:t>683</w:t>
+              <w:t>1</w:t>
             </w:r>
           </w:p>
         </w:tc>
         <w:tc>
           <w:tcPr>
-            <w:tcW w:type="dxa" w:w="1728"/>
+            <w:tcW w:type="dxa" w:w="1584"/>
             <w:shd w:fill="F8FAFC"/>
           </w:tcPr>
           <w:p>
@@ -5115,13 +5115,13 @@
                 <w:color w:val="1E293B"/>
                 <w:sz w:val="18"/>
               </w:rPr>
-              <w:t>12,15%</w:t>
+              <w:t>0,02%</w:t>
             </w:r>
           </w:p>
         </w:tc>
         <w:tc>
           <w:tcPr>
-            <w:tcW w:type="dxa" w:w="3312"/>
+            <w:tcW w:type="dxa" w:w="3600"/>
             <w:shd w:fill="F8FAFC"/>
           </w:tcPr>
           <w:p>
@@ -5134,7 +5134,7 @@
                 <w:color w:val="1E293B"/>
                 <w:sz w:val="18"/>
               </w:rPr>
-              <w:t>FLOTA Trombetas (671 focos) e FLOTA Faro (12 focos)</w:t>
+              <w:t>Zoe (Terra Indígena Zo'é)</w:t>
             </w:r>
           </w:p>
         </w:tc>
@@ -5155,92 +5155,14 @@
                 <w:color w:val="1E293B"/>
                 <w:sz w:val="18"/>
               </w:rPr>
-              <w:t>Área Privada / Outras Áreas</w:t>
-            </w:r>
-          </w:p>
-        </w:tc>
-        <w:tc>
-          <w:tcPr>
-            <w:tcW w:type="dxa" w:w="1728"/>
-            <w:shd w:fill="FFFFFF"/>
-          </w:tcPr>
-          <w:p>
-            <w:pPr>
-              <w:spacing w:before="60" w:after="60"/>
-              <w:jc w:val="left"/>
-            </w:pPr>
-            <w:r>
-              <w:rPr>
-                <w:color w:val="1E293B"/>
-                <w:sz w:val="18"/>
-              </w:rPr>
-              <w:t>283</w:t>
-            </w:r>
-          </w:p>
-        </w:tc>
-        <w:tc>
-          <w:tcPr>
-            <w:tcW w:type="dxa" w:w="1728"/>
-            <w:shd w:fill="FFFFFF"/>
-          </w:tcPr>
-          <w:p>
-            <w:pPr>
-              <w:spacing w:before="60" w:after="60"/>
-              <w:jc w:val="center"/>
-            </w:pPr>
-            <w:r>
-              <w:rPr>
-                <w:color w:val="1E293B"/>
-                <w:sz w:val="18"/>
-              </w:rPr>
-              <w:t>5,03%</w:t>
-            </w:r>
-          </w:p>
-        </w:tc>
-        <w:tc>
-          <w:tcPr>
-            <w:tcW w:type="dxa" w:w="3312"/>
-            <w:shd w:fill="FFFFFF"/>
-          </w:tcPr>
-          <w:p>
-            <w:pPr>
-              <w:spacing w:before="60" w:after="60"/>
-              <w:jc w:val="center"/>
-            </w:pPr>
-            <w:r>
-              <w:rPr>
-                <w:color w:val="1E293B"/>
-                <w:sz w:val="18"/>
-              </w:rPr>
-              <w:t>Zona urbana, sede municipal e propriedades rurais ribeirinhas</w:t>
-            </w:r>
-          </w:p>
-        </w:tc>
-      </w:tr>
-      <w:tr>
-        <w:tc>
-          <w:tcPr>
-            <w:tcW w:type="dxa" w:w="2160"/>
-            <w:shd w:fill="F8FAFC"/>
-          </w:tcPr>
-          <w:p>
-            <w:pPr>
-              <w:spacing w:before="60" w:after="60"/>
-              <w:jc w:val="center"/>
-            </w:pPr>
-            <w:r>
-              <w:rPr>
-                <w:color w:val="1E293B"/>
-                <w:sz w:val="18"/>
-              </w:rPr>
               <w:t>Total Consolidado</w:t>
             </w:r>
           </w:p>
         </w:tc>
         <w:tc>
           <w:tcPr>
-            <w:tcW w:type="dxa" w:w="1728"/>
-            <w:shd w:fill="F8FAFC"/>
+            <w:tcW w:type="dxa" w:w="1584"/>
+            <w:shd w:fill="FFFFFF"/>
           </w:tcPr>
           <w:p>
             <w:pPr>
@@ -5258,8 +5180,8 @@
         </w:tc>
         <w:tc>
           <w:tcPr>
-            <w:tcW w:type="dxa" w:w="1728"/>
-            <w:shd w:fill="F8FAFC"/>
+            <w:tcW w:type="dxa" w:w="1584"/>
+            <w:shd w:fill="FFFFFF"/>
           </w:tcPr>
           <w:p>
             <w:pPr>
@@ -5277,8 +5199,8 @@
         </w:tc>
         <w:tc>
           <w:tcPr>
-            <w:tcW w:type="dxa" w:w="3312"/>
-            <w:shd w:fill="F8FAFC"/>
+            <w:tcW w:type="dxa" w:w="3600"/>
+            <w:shd w:fill="FFFFFF"/>
           </w:tcPr>
           <w:p>
             <w:pPr>
@@ -5290,7 +5212,7 @@
                 <w:color w:val="1E293B"/>
                 <w:sz w:val="18"/>
               </w:rPr>
-              <w:t>Município de Óbidos (PA)</w:t>
+              <w:t>27 Territórios Oficiais de Óbidos (PA)</w:t>
             </w:r>
           </w:p>
         </w:tc>
@@ -5324,7 +5246,7 @@
       <w:r>
         <w:drawing>
           <wp:inline xmlns:a="http://schemas.openxmlformats.org/drawingml/2006/main" xmlns:pic="http://schemas.openxmlformats.org/drawingml/2006/picture">
-            <wp:extent cx="5303520" cy="2617923"/>
+            <wp:extent cx="5303520" cy="2614411"/>
             <wp:docPr id="12" name="Picture 12"/>
             <wp:cNvGraphicFramePr>
               <a:graphicFrameLocks noChangeAspect="1"/>
@@ -5345,7 +5267,7 @@
                   <pic:spPr>
                     <a:xfrm>
                       <a:off x="0" y="0"/>
-                      <a:ext cx="5303520" cy="2617923"/>
+                      <a:ext cx="5303520" cy="2614411"/>
                     </a:xfrm>
                     <a:prstGeom prst="rect"/>
                   </pic:spPr>
@@ -5379,7 +5301,7 @@
       <w:r>
         <w:drawing>
           <wp:inline xmlns:a="http://schemas.openxmlformats.org/drawingml/2006/main" xmlns:pic="http://schemas.openxmlformats.org/drawingml/2006/picture">
-            <wp:extent cx="4754880" cy="3440776"/>
+            <wp:extent cx="4754880" cy="3405964"/>
             <wp:docPr id="13" name="Picture 13"/>
             <wp:cNvGraphicFramePr>
               <a:graphicFrameLocks noChangeAspect="1"/>
@@ -5400,7 +5322,7 @@
                   <pic:spPr>
                     <a:xfrm>
                       <a:off x="0" y="0"/>
-                      <a:ext cx="4754880" cy="3440776"/>
+                      <a:ext cx="4754880" cy="3405964"/>
                     </a:xfrm>
                     <a:prstGeom prst="rect"/>
                   </pic:spPr>
@@ -5436,7 +5358,7 @@
           <w:color w:val="1E293B"/>
           <w:sz w:val="22"/>
         </w:rPr>
-        <w:t>Os dados revelam que as áreas comunitárias tradicionais (Territórios Quilombolas e Projetos de Assentamento Agroextrativista) e as bordas de Terras Indígenas concentram expressiva atividade de fogo, demandando ações de manejo integrado do fogo, fortalecimento de brigadas comunitárias e assistência técnica para alternativas agrícolas sustentáveis.</w:t>
+        <w:t>Os dados revelam que os Projetos de Assentamento (PAEs e PAs) e as Áreas Quilombolas (PAQ Cabeceiras e PAQ Erepecurú) concentram a maior parte dos focos antrópicos, enquanto o Parque do Tumucumaque e a FLOTA Trombetas demandam monitoramento aéreo preventivo constante nas zonas de amortecimento.</w:t>
       </w:r>
     </w:p>
     <w:p>

</xml_diff>

<commit_message>
fix(territorios): classificar Parque do Tumucumaque como Terra/Area Indigena
- Reclassificar Parque do Tumucumaque na categoria Terra Indigena (TI)
- Atualizar tabelas estatisticas de Terras Indigenas e Unidades de Conservacao
- Regenerar graficos de distribuicao territorial (barras e pizza)
- Recompilar relatorio tecnico oficial PDF e artigo academico DOCX
</commit_message>
<xml_diff>
--- a/Projeto_Queimadas_Artigo.docx
+++ b/Projeto_Queimadas_Artigo.docx
@@ -4921,7 +4921,7 @@
                 <w:color w:val="1E293B"/>
                 <w:sz w:val="18"/>
               </w:rPr>
-              <w:t>Unidades de Conservação (UC)</w:t>
+              <w:t>Áreas Quilombolas (PAQ)</w:t>
             </w:r>
           </w:p>
         </w:tc>
@@ -4940,7 +4940,7 @@
                 <w:color w:val="1E293B"/>
                 <w:sz w:val="18"/>
               </w:rPr>
-              <w:t>1.706</w:t>
+              <w:t>1.415</w:t>
             </w:r>
           </w:p>
         </w:tc>
@@ -4959,7 +4959,7 @@
                 <w:color w:val="1E293B"/>
                 <w:sz w:val="18"/>
               </w:rPr>
-              <w:t>30,35%</w:t>
+              <w:t>25,17%</w:t>
             </w:r>
           </w:p>
         </w:tc>
@@ -4978,7 +4978,7 @@
                 <w:color w:val="1E293B"/>
                 <w:sz w:val="18"/>
               </w:rPr>
-              <w:t>Parque do Tumucumaque (1.356), FLORESTA ESTADUAL DO TROMBETAS (348), ESEC Grão-Pará (2) e FLOTA Paru</w:t>
+              <w:t>PAQ ESPECIAL QUILOMBOLA ÁREA DAS CABECEIRAS (1.071) e PAQ ESPECIAL QUILOMBOLA EREPECURÚ (344)</w:t>
             </w:r>
           </w:p>
         </w:tc>
@@ -4999,7 +4999,7 @@
                 <w:color w:val="1E293B"/>
                 <w:sz w:val="18"/>
               </w:rPr>
-              <w:t>Áreas Quilombolas (PAQ)</w:t>
+              <w:t>Terras Indígenas / Áreas Indígenas (TI)</w:t>
             </w:r>
           </w:p>
         </w:tc>
@@ -5018,7 +5018,7 @@
                 <w:color w:val="1E293B"/>
                 <w:sz w:val="18"/>
               </w:rPr>
-              <w:t>1.415</w:t>
+              <w:t>1.357</w:t>
             </w:r>
           </w:p>
         </w:tc>
@@ -5037,7 +5037,7 @@
                 <w:color w:val="1E293B"/>
                 <w:sz w:val="18"/>
               </w:rPr>
-              <w:t>25,17%</w:t>
+              <w:t>24,14%</w:t>
             </w:r>
           </w:p>
         </w:tc>
@@ -5056,7 +5056,7 @@
                 <w:color w:val="1E293B"/>
                 <w:sz w:val="18"/>
               </w:rPr>
-              <w:t>PAQ ESPECIAL QUILOMBOLA ÁREA DAS CABECEIRAS (1.071) e PAQ ESPECIAL QUILOMBOLA EREPECURÚ (344)</w:t>
+              <w:t>Parque do Tumucumaque (1.356) e Zoe (1)</w:t>
             </w:r>
           </w:p>
         </w:tc>
@@ -5077,7 +5077,7 @@
                 <w:color w:val="1E293B"/>
                 <w:sz w:val="18"/>
               </w:rPr>
-              <w:t>Terras Indígenas (TI)</w:t>
+              <w:t>Unidades de Conservação (UC)</w:t>
             </w:r>
           </w:p>
         </w:tc>
@@ -5096,7 +5096,7 @@
                 <w:color w:val="1E293B"/>
                 <w:sz w:val="18"/>
               </w:rPr>
-              <w:t>1</w:t>
+              <w:t>350</w:t>
             </w:r>
           </w:p>
         </w:tc>
@@ -5115,7 +5115,7 @@
                 <w:color w:val="1E293B"/>
                 <w:sz w:val="18"/>
               </w:rPr>
-              <w:t>0,02%</w:t>
+              <w:t>6,23%</w:t>
             </w:r>
           </w:p>
         </w:tc>
@@ -5134,7 +5134,7 @@
                 <w:color w:val="1E293B"/>
                 <w:sz w:val="18"/>
               </w:rPr>
-              <w:t>Zoe (Terra Indígena Zo'é)</w:t>
+              <w:t>FLORESTA ESTADUAL DO TROMBETAS (348), ESEC Grão-Pará (2) e FLOTA Paru (0)</w:t>
             </w:r>
           </w:p>
         </w:tc>
@@ -5301,7 +5301,7 @@
       <w:r>
         <w:drawing>
           <wp:inline xmlns:a="http://schemas.openxmlformats.org/drawingml/2006/main" xmlns:pic="http://schemas.openxmlformats.org/drawingml/2006/picture">
-            <wp:extent cx="4754880" cy="3405964"/>
+            <wp:extent cx="4754880" cy="3305631"/>
             <wp:docPr id="13" name="Picture 13"/>
             <wp:cNvGraphicFramePr>
               <a:graphicFrameLocks noChangeAspect="1"/>
@@ -5322,7 +5322,7 @@
                   <pic:spPr>
                     <a:xfrm>
                       <a:off x="0" y="0"/>
-                      <a:ext cx="4754880" cy="3405964"/>
+                      <a:ext cx="4754880" cy="3305631"/>
                     </a:xfrm>
                     <a:prstGeom prst="rect"/>
                   </pic:spPr>
@@ -5358,7 +5358,7 @@
           <w:color w:val="1E293B"/>
           <w:sz w:val="22"/>
         </w:rPr>
-        <w:t>Os dados revelam que os Projetos de Assentamento (PAEs e PAs) e as Áreas Quilombolas (PAQ Cabeceiras e PAQ Erepecurú) concentram a maior parte dos focos antrópicos, enquanto o Parque do Tumucumaque e a FLOTA Trombetas demandam monitoramento aéreo preventivo constante nas zonas de amortecimento.</w:t>
+        <w:t>Os dados revelam que os Projetos de Assentamento (PAEs e PAs) e as Áreas Quilombolas (PAQ Cabeceiras e PAQ Erepecurú) concentram a maior parte dos focos antrópicos, enquanto as Áreas Indígenas ao norte (Parque do Tumucumaque e TI Zo'é) e a FLOTA Trombetas demandam monitoramento aéreo preventivo constante nas zonas de amortecimento.</w:t>
       </w:r>
     </w:p>
     <w:p>

</xml_diff>